<commit_message>
feat: add student, guardian, and teacher management features
- Implemented Swagger documentation for student-guardian and teacher APIs.
- Created migrations for Teachers, Students, Guardians, and StudentGuardians tables.
- Developed models for Teacher, Student, Guardian, and StudentGuardian with associations.
- Added routes for managing guardians, students, and teachers with appropriate permissions.
- Implemented services for handling business logic related to guardians, students, and teachers.
- Seeded initial permissions and role-permission mappings for the new entities.
</commit_message>
<xml_diff>
--- a/docs/project-documentation.docx
+++ b/docs/project-documentation.docx
@@ -194,6 +194,18 @@
     <w:abstractNumId w:val="0"/>
   </w:num>
   <w:num w:numId="9">
+    <w:abstractNumId w:val="0"/>
+  </w:num>
+  <w:num w:numId="10">
+    <w:abstractNumId w:val="0"/>
+  </w:num>
+  <w:num w:numId="11">
+    <w:abstractNumId w:val="0"/>
+  </w:num>
+  <w:num w:numId="12">
+    <w:abstractNumId w:val="0"/>
+  </w:num>
+  <w:num w:numId="13">
     <w:abstractNumId w:val="0"/>
   </w:num>
 </w:numbering>

</xml_diff>

<commit_message>
docs: mise à jour de la documentation projet (tableau de bord, export de classe)
Co-Authored-By: Claude Opus 5.5 <noreply@anthropic.com>
</commit_message>
<xml_diff>
--- a/docs/project-documentation.docx
+++ b/docs/project-documentation.docx
@@ -19,7 +19,7 @@
         <w:t xml:space="preserve"> · </w:t>
       </w:r>
       <w:r>
-        <w:t xml:space="preserve">@Someone</w:t>
+        <w:t xml:space="preserve">@Moussa</w:t>
       </w:r>
     </w:p>
     <w:p>
@@ -1664,6 +1664,18 @@
     </w:p>
     <w:p>
       <w:pPr>
+        <w:pStyle w:val="ListParagraph"/>
+        <w:numPr>
+          <w:ilvl w:val="0"/>
+          <w:numId w:val="14"/>
+        </w:numPr>
+      </w:pPr>
+      <w:r>
+        <w:t xml:space="preserve">Export PDF de la liste des élèves par classe (A4 paysage, titres de colonnes répétés et numéro de page sur chaque page) : élèves actifs et redoublants, triés par nom et numérotés (utilisable comme liste d'appel), avec matricule, sexe, date de naissance, statut, n° et date d'inscription, tuteur principal et son téléphone. En-tête avec école, classe, année scolaire et effectif garçons/filles. Réservé à la permission de consultation des inscriptions, limité à sa propre école.</w:t>
+      </w:r>
+    </w:p>
+    <w:p>
+      <w:pPr>
         <w:pStyle w:val="Heading3"/>
       </w:pPr>
       <w:r>
@@ -2190,6 +2202,333 @@
       </w:r>
       <w:r>
         <w:t xml:space="preserve"> visible via l'API) — aucun blocage d'accès n'est implémenté, la règle métier n'étant pas encore définie.</w:t>
+      </w:r>
+    </w:p>
+    <w:p>
+      <w:pPr>
+        <w:pStyle w:val="Heading2"/>
+      </w:pPr>
+      <w:r>
+        <w:t xml:space="preserve">Tableau de bord</w:t>
+      </w:r>
+    </w:p>
+    <w:p>
+      <w:pPr/>
+      <w:r>
+        <w:t xml:space="preserve">Le tableau de bord affiche les statistiques de l'année scolaire courante, adaptées au rôle : une école pour ses administrateurs, toutes les écoles pour le SUPER_ADMIN, ses classes pour un enseignant, le solde à payer pour un parent.</w:t>
+      </w:r>
+    </w:p>
+    <w:p>
+      <w:pPr>
+        <w:pStyle w:val="Heading3"/>
+      </w:pPr>
+      <w:r>
+        <w:t xml:space="preserve">Graphiques (école et plateforme)</w:t>
+      </w:r>
+    </w:p>
+    <w:tbl>
+      <w:tblPr>
+        <w:tblStyle w:val="TableGrid"/>
+        <w:tblW w:w="0" w:type="auto"/>
+        <w:tblLayout w:type="fixed"/>
+        <w:tblLook w:val="04A0" w:firstRow="1" w:lastRow="0" w:firstColumn="0" w:lastColumn="0" w:noHBand="0" w:noVBand="1"/>
+      </w:tblPr>
+      <w:tblGrid>
+        <w:gridCol w:w="3120"/>
+        <w:gridCol w:w="3120"/>
+        <w:gridCol w:w="3120"/>
+      </w:tblGrid>
+      <w:tr>
+        <w:trPr>
+          <w:tblHeader/>
+        </w:trPr>
+        <w:tc>
+          <w:tcPr>
+            <w:tcW w:w="3120" w:type="dxa"/>
+            <w:shd w:val="clear" w:color="auto" w:fill="F2F2F2"/>
+          </w:tcPr>
+          <w:p>
+            <w:pPr/>
+            <w:r>
+              <w:t xml:space="preserve">Graphique</w:t>
+            </w:r>
+          </w:p>
+        </w:tc>
+        <w:tc>
+          <w:tcPr>
+            <w:tcW w:w="3120" w:type="dxa"/>
+            <w:shd w:val="clear" w:color="auto" w:fill="F2F2F2"/>
+          </w:tcPr>
+          <w:p>
+            <w:pPr/>
+            <w:r>
+              <w:t xml:space="preserve">Statistique</w:t>
+            </w:r>
+          </w:p>
+        </w:tc>
+        <w:tc>
+          <w:tcPr>
+            <w:tcW w:w="3120" w:type="dxa"/>
+            <w:shd w:val="clear" w:color="auto" w:fill="F2F2F2"/>
+          </w:tcPr>
+          <w:p>
+            <w:pPr/>
+            <w:r>
+              <w:t xml:space="preserve">Lecture</w:t>
+            </w:r>
+          </w:p>
+        </w:tc>
+      </w:tr>
+      <w:tr>
+        <w:tc>
+          <w:tcPr>
+            <w:tcW w:w="3120" w:type="dxa"/>
+          </w:tcPr>
+          <w:p>
+            <w:pPr/>
+            <w:r>
+              <w:t xml:space="preserve">Jauge</w:t>
+            </w:r>
+          </w:p>
+        </w:tc>
+        <w:tc>
+          <w:tcPr>
+            <w:tcW w:w="3120" w:type="dxa"/>
+          </w:tcPr>
+          <w:p>
+            <w:pPr/>
+            <w:r>
+              <w:t xml:space="preserve">Taux de recouvrement (encaissé / dû)</w:t>
+            </w:r>
+          </w:p>
+        </w:tc>
+        <w:tc>
+          <w:tcPr>
+            <w:tcW w:w="3120" w:type="dxa"/>
+          </w:tcPr>
+          <w:p>
+            <w:pPr/>
+            <w:r>
+              <w:t xml:space="preserve">Rouge sous 50 %, orange de 50 à 80 %, vert au-delà</w:t>
+            </w:r>
+          </w:p>
+        </w:tc>
+      </w:tr>
+      <w:tr>
+        <w:tc>
+          <w:tcPr>
+            <w:tcW w:w="3120" w:type="dxa"/>
+          </w:tcPr>
+          <w:p>
+            <w:pPr/>
+            <w:r>
+              <w:t xml:space="preserve">Donut</w:t>
+            </w:r>
+          </w:p>
+        </w:tc>
+        <w:tc>
+          <w:tcPr>
+            <w:tcW w:w="3120" w:type="dxa"/>
+          </w:tcPr>
+          <w:p>
+            <w:pPr/>
+            <w:r>
+              <w:t xml:space="preserve">Statut des échéances : réglées, partielles, en attente, en retard</w:t>
+            </w:r>
+          </w:p>
+        </w:tc>
+        <w:tc>
+          <w:tcPr>
+            <w:tcW w:w="3120" w:type="dxa"/>
+          </w:tcPr>
+          <w:p>
+            <w:pPr/>
+            <w:r>
+              <w:t xml:space="preserve">Même règle de statut que le module Scolarité</w:t>
+            </w:r>
+          </w:p>
+        </w:tc>
+      </w:tr>
+      <w:tr>
+        <w:tc>
+          <w:tcPr>
+            <w:tcW w:w="3120" w:type="dxa"/>
+          </w:tcPr>
+          <w:p>
+            <w:pPr/>
+            <w:r>
+              <w:t xml:space="preserve">Aire</w:t>
+            </w:r>
+          </w:p>
+        </w:tc>
+        <w:tc>
+          <w:tcPr>
+            <w:tcW w:w="3120" w:type="dxa"/>
+          </w:tcPr>
+          <w:p>
+            <w:pPr/>
+            <w:r>
+              <w:t xml:space="preserve">Montants encaissés par mois</w:t>
+            </w:r>
+          </w:p>
+        </w:tc>
+        <w:tc>
+          <w:tcPr>
+            <w:tcW w:w="3120" w:type="dxa"/>
+          </w:tcPr>
+          <w:p>
+            <w:pPr/>
+            <w:r>
+              <w:t xml:space="preserve">Du début de l'année scolaire au mois en cours</w:t>
+            </w:r>
+          </w:p>
+        </w:tc>
+      </w:tr>
+      <w:tr>
+        <w:tc>
+          <w:tcPr>
+            <w:tcW w:w="3120" w:type="dxa"/>
+          </w:tcPr>
+          <w:p>
+            <w:pPr/>
+            <w:r>
+              <w:t xml:space="preserve">Courbe</w:t>
+            </w:r>
+          </w:p>
+        </w:tc>
+        <w:tc>
+          <w:tcPr>
+            <w:tcW w:w="3120" w:type="dxa"/>
+          </w:tcPr>
+          <w:p>
+            <w:pPr/>
+            <w:r>
+              <w:t xml:space="preserve">Inscriptions par mois</w:t>
+            </w:r>
+          </w:p>
+        </w:tc>
+        <w:tc>
+          <w:tcPr>
+            <w:tcW w:w="3120" w:type="dxa"/>
+          </w:tcPr>
+          <w:p>
+            <w:pPr/>
+            <w:r>
+              <w:t xml:space="preserve">Date d'inscription, sinon date de saisie</w:t>
+            </w:r>
+          </w:p>
+        </w:tc>
+      </w:tr>
+      <w:tr>
+        <w:tc>
+          <w:tcPr>
+            <w:tcW w:w="3120" w:type="dxa"/>
+          </w:tcPr>
+          <w:p>
+            <w:pPr/>
+            <w:r>
+              <w:t xml:space="preserve">Donut</w:t>
+            </w:r>
+          </w:p>
+        </w:tc>
+        <w:tc>
+          <w:tcPr>
+            <w:tcW w:w="3120" w:type="dxa"/>
+          </w:tcPr>
+          <w:p>
+            <w:pPr/>
+            <w:r>
+              <w:t xml:space="preserve">Élèves par sexe (garçons, filles, non renseigné)</w:t>
+            </w:r>
+          </w:p>
+        </w:tc>
+        <w:tc>
+          <w:tcPr>
+            <w:tcW w:w="3120" w:type="dxa"/>
+          </w:tcPr>
+          <w:p>
+            <w:pPr/>
+            <w:r>
+              <w:t xml:space="preserve">Élèves inscrits et actifs de l'année</w:t>
+            </w:r>
+          </w:p>
+        </w:tc>
+      </w:tr>
+      <w:tr>
+        <w:tc>
+          <w:tcPr>
+            <w:tcW w:w="3120" w:type="dxa"/>
+          </w:tcPr>
+          <w:p>
+            <w:pPr/>
+            <w:r>
+              <w:t xml:space="preserve">Colonnes</w:t>
+            </w:r>
+          </w:p>
+        </w:tc>
+        <w:tc>
+          <w:tcPr>
+            <w:tcW w:w="3120" w:type="dxa"/>
+          </w:tcPr>
+          <w:p>
+            <w:pPr/>
+            <w:r>
+              <w:t xml:space="preserve">Effectifs par niveau (cycle)</w:t>
+            </w:r>
+          </w:p>
+        </w:tc>
+        <w:tc>
+          <w:tcPr>
+            <w:tcW w:w="3120" w:type="dxa"/>
+          </w:tcPr>
+          <w:p>
+            <w:pPr/>
+            <w:r>
+              <w:t xml:space="preserve">Primaire, Collège, Lycée…</w:t>
+            </w:r>
+          </w:p>
+        </w:tc>
+      </w:tr>
+      <w:tr>
+        <w:tc>
+          <w:tcPr>
+            <w:tcW w:w="3120" w:type="dxa"/>
+          </w:tcPr>
+          <w:p>
+            <w:pPr/>
+            <w:r>
+              <w:t xml:space="preserve">Barres</w:t>
+            </w:r>
+          </w:p>
+        </w:tc>
+        <w:tc>
+          <w:tcPr>
+            <w:tcW w:w="3120" w:type="dxa"/>
+          </w:tcPr>
+          <w:p>
+            <w:pPr/>
+            <w:r>
+              <w:t xml:space="preserve">Taux de présence par classe (par école pour le SUPER_ADMIN)</w:t>
+            </w:r>
+          </w:p>
+        </w:tc>
+        <w:tc>
+          <w:tcPr>
+            <w:tcW w:w="3120" w:type="dxa"/>
+          </w:tcPr>
+          <w:p>
+            <w:pPr/>
+            <w:r>
+              <w:t xml:space="preserve">Trié du plus faible au plus fort, pour repérer les classes en difficulté</w:t>
+            </w:r>
+          </w:p>
+        </w:tc>
+      </w:tr>
+    </w:tbl>
+    <w:p>
+      <w:pPr/>
+      <w:r>
+        <w:t xml:space="preserve">Les mois sans activité restent affichés à 0 pour garder un axe du temps continu. Au niveau plateforme, les chiffres sont recalculés à partir des montants et effectifs bruts de chaque école, jamais en moyennant des taux.</w:t>
       </w:r>
     </w:p>
     <w:p>

</xml_diff>